<commit_message>
inserimento indirizzi per personale 1.4 on sistemazione all10 firenze
</commit_message>
<xml_diff>
--- a/public/templates/ALLEGATO_10_FIRENZE.docx
+++ b/public/templates/ALLEGATO_10_FIRENZE.docx
@@ -1104,7 +1104,7 @@
           <w:u w:val="single" w:color="000000"/>
           <w:lang w:val="it-IT"/>
         </w:rPr>
-        <w:t xml:space="preserve">                                                                                                                                                                                                                           </w:t>
+        <w:t xml:space="preserve">{{NOME_UTENTE}}</w:t>
       </w:r>
       <w:r>
         <w:rPr>
@@ -1250,7 +1250,7 @@
           <w:u w:val="single" w:color="000000"/>
           <w:lang w:val="it-IT"/>
         </w:rPr>
-        <w:t xml:space="preserve">                                 </w:t>
+        <w:t xml:space="preserve">{{STRADA}}</w:t>
       </w:r>
       <w:r>
         <w:rPr>
@@ -1260,7 +1260,7 @@
           <w:u w:val="single" w:color="000000"/>
           <w:lang w:val="it-IT"/>
         </w:rPr>
-        <w:t xml:space="preserve">                                                            </w:t>
+        <w:t xml:space="preserve">{{NOME_LOCALITA}}</w:t>
       </w:r>
       <w:r>
         <w:rPr>
@@ -1270,7 +1270,7 @@
           <w:u w:val="single" w:color="000000"/>
           <w:lang w:val="it-IT"/>
         </w:rPr>
-        <w:t xml:space="preserve">                            </w:t>
+        <w:t xml:space="preserve">{{CAMPO_28}}</w:t>
       </w:r>
       <w:r>
         <w:rPr>
@@ -1384,7 +1384,7 @@
           <w:u w:val="single" w:color="000000"/>
           <w:lang w:val="it-IT"/>
         </w:rPr>
-        <w:t xml:space="preserve">              </w:t>
+        <w:t xml:space="preserve">{{CAMPO_14}}</w:t>
       </w:r>
       <w:r>
         <w:rPr>
@@ -1394,7 +1394,7 @@
           <w:u w:val="single" w:color="000000"/>
           <w:lang w:val="it-IT"/>
         </w:rPr>
-        <w:t xml:space="preserve">         </w:t>
+        <w:t xml:space="preserve">{{CAMPO_9}}</w:t>
       </w:r>
       <w:r>
         <w:rPr>
@@ -1404,7 +1404,7 @@
           <w:u w:val="single" w:color="000000"/>
           <w:lang w:val="it-IT"/>
         </w:rPr>
-        <w:t xml:space="preserve">                                                         </w:t>
+        <w:t xml:space="preserve">{{CAMPO_57}}</w:t>
       </w:r>
       <w:r>
         <w:rPr>
@@ -1477,7 +1477,7 @@
           <w:u w:val="single" w:color="000000"/>
           <w:lang w:val="it-IT"/>
         </w:rPr>
-        <w:t xml:space="preserve">                               </w:t>
+        <w:t xml:space="preserve">{{RECAPITO}}</w:t>
       </w:r>
       <w:r>
         <w:rPr>
@@ -1487,7 +1487,7 @@
           <w:u w:val="single" w:color="000000"/>
           <w:lang w:val="it-IT"/>
         </w:rPr>
-        <w:t xml:space="preserve">                                                                                       </w:t>
+        <w:t xml:space="preserve">{{CAMPO_87}}</w:t>
       </w:r>
       <w:r>
         <w:rPr>
@@ -1577,7 +1577,7 @@
           <w:u w:val="single" w:color="000000"/>
           <w:lang w:val="it-IT"/>
         </w:rPr>
-        <w:t xml:space="preserve">                 </w:t>
+        <w:t xml:space="preserve">{{PDR}}</w:t>
       </w:r>
       <w:r>
         <w:rPr>
@@ -1587,7 +1587,7 @@
           <w:u w:val="single" w:color="000000"/>
           <w:lang w:val="it-IT"/>
         </w:rPr>
-        <w:t xml:space="preserve">                                                                            </w:t>
+        <w:t xml:space="preserve">{{CAMPO_76}}</w:t>
       </w:r>
       <w:r>
         <w:rPr>
@@ -1748,7 +1748,7 @@
           <w:u w:val="single" w:color="000000"/>
           <w:lang w:val="it-IT"/>
         </w:rPr>
-        <w:t xml:space="preserve">                                                                                    </w:t>
+        <w:t xml:space="preserve">{{ODS}}</w:t>
       </w:r>
       <w:r>
         <w:rPr>
@@ -1882,7 +1882,7 @@
           <w:u w:val="single" w:color="000000"/>
           <w:lang w:val="it-IT"/>
         </w:rPr>
-        <w:t xml:space="preserve">           </w:t>
+        <w:t xml:space="preserve">{{CAMPO_11}}</w:t>
       </w:r>
       <w:r>
         <w:rPr>
@@ -1892,7 +1892,7 @@
           <w:u w:val="single" w:color="000000"/>
           <w:lang w:val="it-IT"/>
         </w:rPr>
-        <w:t xml:space="preserve">                                                                                </w:t>
+        <w:t xml:space="preserve">{{DATA}}</w:t>
       </w:r>
     </w:p>
     <w:p>

</xml_diff>

<commit_message>
fix modulo firenze 3.0
</commit_message>
<xml_diff>
--- a/public/templates/ALLEGATO_10_FIRENZE.docx
+++ b/public/templates/ALLEGATO_10_FIRENZE.docx
@@ -1662,7 +1662,7 @@
           <w:szCs w:val="15"/>
           <w:lang w:val="it-IT"/>
         </w:rPr>
-        <w:t xml:space="preserve">:                                                                                             </w:t>
+        <w:t xml:space="preserve">: {{NUMERO_PRATICA}}</w:t>
       </w:r>
     </w:p>
     <w:p>
@@ -10016,7 +10016,7 @@
           <w:u w:val="single" w:color="000000"/>
           <w:lang w:val="it-IT"/>
         </w:rPr>
-        <w:t xml:space="preserve"> </w:t>
+        <w:t xml:space="preserve">{{MATRICOLA_ESISTENTE}}</w:t>
       </w:r>
       <w:r>
         <w:rPr>
@@ -11333,7 +11333,7 @@
           <w:u w:val="single" w:color="000000"/>
           <w:lang w:val="it-IT"/>
         </w:rPr>
-        <w:t xml:space="preserve">                                    </w:t>
+        <w:t xml:space="preserve">{{ESEGUITO_DATA}}</w:t>
       </w:r>
       <w:r>
         <w:rPr>
@@ -11507,7 +11507,7 @@
           <w:u w:val="single" w:color="000000"/>
           <w:lang w:val="it-IT"/>
         </w:rPr>
-        <w:t xml:space="preserve"> </w:t>
+        <w:t xml:space="preserve">{{ADDETTO}}</w:t>
       </w:r>
       <w:r>
         <w:rPr>

</xml_diff>

<commit_message>
fix modulo firenze 4.0
</commit_message>
<xml_diff>
--- a/public/templates/ALLEGATO_10_FIRENZE.docx
+++ b/public/templates/ALLEGATO_10_FIRENZE.docx
@@ -1056,12 +1056,12 @@
     </w:p>
     <w:p>
       <w:pPr>
-        <w:spacing w:after="0" w:line="411" w:lineRule="auto"/>
+        <w:spacing w:after="0" w:line="325" w:lineRule="auto"/>
         <w:ind w:left="108" w:right="77"/>
         <w:rPr>
           <w:rFonts w:ascii="Arial" w:eastAsia="Arial" w:hAnsi="Arial" w:cs="Arial"/>
-          <w:sz w:val="15"/>
-          <w:szCs w:val="15"/>
+          <w:sz w:val="19"/>
+          <w:szCs w:val="19"/>
           <w:lang w:val="it-IT"/>
         </w:rPr>
       </w:pPr>
@@ -1069,8 +1069,8 @@
         <w:rPr>
           <w:rFonts w:ascii="Arial" w:eastAsia="Arial" w:hAnsi="Arial" w:cs="Arial"/>
           <w:w w:val="103"/>
-          <w:sz w:val="15"/>
-          <w:szCs w:val="15"/>
+          <w:sz w:val="19"/>
+          <w:szCs w:val="19"/>
           <w:lang w:val="it-IT"/>
         </w:rPr>
         <w:t>Nome:</w:t>
@@ -1079,8 +1079,8 @@
         <w:rPr>
           <w:rFonts w:ascii="Arial" w:eastAsia="Arial" w:hAnsi="Arial" w:cs="Arial"/>
           <w:spacing w:val="2"/>
-          <w:sz w:val="15"/>
-          <w:szCs w:val="15"/>
+          <w:sz w:val="19"/>
+          <w:szCs w:val="19"/>
           <w:lang w:val="it-IT"/>
         </w:rPr>
         <w:t xml:space="preserve"> </w:t>
@@ -1089,8 +1089,8 @@
         <w:rPr>
           <w:rFonts w:ascii="Arial" w:eastAsia="Arial" w:hAnsi="Arial" w:cs="Arial"/>
           <w:w w:val="103"/>
-          <w:sz w:val="15"/>
-          <w:szCs w:val="15"/>
+          <w:sz w:val="19"/>
+          <w:szCs w:val="19"/>
           <w:u w:val="single" w:color="000000"/>
           <w:lang w:val="it-IT"/>
         </w:rPr>
@@ -1099,8 +1099,8 @@
       <w:r>
         <w:rPr>
           <w:rFonts w:ascii="Arial" w:eastAsia="Arial" w:hAnsi="Arial" w:cs="Arial"/>
-          <w:sz w:val="15"/>
-          <w:szCs w:val="15"/>
+          <w:sz w:val="19"/>
+          <w:szCs w:val="19"/>
           <w:u w:val="single" w:color="000000"/>
           <w:lang w:val="it-IT"/>
         </w:rPr>
@@ -1109,8 +1109,8 @@
       <w:r>
         <w:rPr>
           <w:rFonts w:ascii="Arial" w:eastAsia="Arial" w:hAnsi="Arial" w:cs="Arial"/>
-          <w:sz w:val="15"/>
-          <w:szCs w:val="15"/>
+          <w:sz w:val="19"/>
+          <w:szCs w:val="19"/>
           <w:u w:val="single" w:color="000000"/>
           <w:lang w:val="it-IT"/>
         </w:rPr>
@@ -1119,8 +1119,8 @@
       <w:r>
         <w:rPr>
           <w:rFonts w:ascii="Arial" w:eastAsia="Arial" w:hAnsi="Arial" w:cs="Arial"/>
-          <w:sz w:val="15"/>
-          <w:szCs w:val="15"/>
+          <w:sz w:val="19"/>
+          <w:szCs w:val="19"/>
           <w:u w:val="single" w:color="000000"/>
           <w:lang w:val="it-IT"/>
         </w:rPr>
@@ -1130,8 +1130,8 @@
         <w:rPr>
           <w:rFonts w:ascii="Arial" w:eastAsia="Arial" w:hAnsi="Arial" w:cs="Arial"/>
           <w:spacing w:val="-16"/>
-          <w:sz w:val="15"/>
-          <w:szCs w:val="15"/>
+          <w:sz w:val="19"/>
+          <w:szCs w:val="19"/>
           <w:u w:val="single" w:color="000000"/>
           <w:lang w:val="it-IT"/>
         </w:rPr>
@@ -1141,8 +1141,8 @@
         <w:rPr>
           <w:rFonts w:ascii="Arial" w:eastAsia="Arial" w:hAnsi="Arial" w:cs="Arial"/>
           <w:spacing w:val="-16"/>
-          <w:sz w:val="15"/>
-          <w:szCs w:val="15"/>
+          <w:sz w:val="19"/>
+          <w:szCs w:val="19"/>
           <w:lang w:val="it-IT"/>
         </w:rPr>
         <w:t xml:space="preserve"> </w:t>
@@ -1151,8 +1151,8 @@
         <w:rPr>
           <w:rFonts w:ascii="Arial" w:eastAsia="Arial" w:hAnsi="Arial" w:cs="Arial"/>
           <w:w w:val="103"/>
-          <w:sz w:val="15"/>
-          <w:szCs w:val="15"/>
+          <w:sz w:val="19"/>
+          <w:szCs w:val="19"/>
           <w:lang w:val="it-IT"/>
         </w:rPr>
         <w:t>I</w:t>
@@ -1162,8 +1162,8 @@
           <w:rFonts w:ascii="Arial" w:eastAsia="Arial" w:hAnsi="Arial" w:cs="Arial"/>
           <w:spacing w:val="-1"/>
           <w:w w:val="103"/>
-          <w:sz w:val="15"/>
-          <w:szCs w:val="15"/>
+          <w:sz w:val="19"/>
+          <w:szCs w:val="19"/>
           <w:lang w:val="it-IT"/>
         </w:rPr>
         <w:t>n</w:t>
@@ -1172,8 +1172,8 @@
         <w:rPr>
           <w:rFonts w:ascii="Arial" w:eastAsia="Arial" w:hAnsi="Arial" w:cs="Arial"/>
           <w:w w:val="103"/>
-          <w:sz w:val="15"/>
-          <w:szCs w:val="15"/>
+          <w:sz w:val="19"/>
+          <w:szCs w:val="19"/>
           <w:lang w:val="it-IT"/>
         </w:rPr>
         <w:t>d</w:t>
@@ -1183,8 +1183,8 @@
           <w:rFonts w:ascii="Arial" w:eastAsia="Arial" w:hAnsi="Arial" w:cs="Arial"/>
           <w:spacing w:val="2"/>
           <w:w w:val="103"/>
-          <w:sz w:val="15"/>
-          <w:szCs w:val="15"/>
+          <w:sz w:val="19"/>
+          <w:szCs w:val="19"/>
           <w:lang w:val="it-IT"/>
         </w:rPr>
         <w:t>i</w:t>
@@ -1194,8 +1194,8 @@
           <w:rFonts w:ascii="Arial" w:eastAsia="Arial" w:hAnsi="Arial" w:cs="Arial"/>
           <w:spacing w:val="-1"/>
           <w:w w:val="103"/>
-          <w:sz w:val="15"/>
-          <w:szCs w:val="15"/>
+          <w:sz w:val="19"/>
+          <w:szCs w:val="19"/>
           <w:lang w:val="it-IT"/>
         </w:rPr>
         <w:t>r</w:t>
@@ -1205,8 +1205,8 @@
           <w:rFonts w:ascii="Arial" w:eastAsia="Arial" w:hAnsi="Arial" w:cs="Arial"/>
           <w:spacing w:val="2"/>
           <w:w w:val="103"/>
-          <w:sz w:val="15"/>
-          <w:szCs w:val="15"/>
+          <w:sz w:val="19"/>
+          <w:szCs w:val="19"/>
           <w:lang w:val="it-IT"/>
         </w:rPr>
         <w:t>i</w:t>
@@ -1215,8 +1215,8 @@
         <w:rPr>
           <w:rFonts w:ascii="Arial" w:eastAsia="Arial" w:hAnsi="Arial" w:cs="Arial"/>
           <w:w w:val="103"/>
-          <w:sz w:val="15"/>
-          <w:szCs w:val="15"/>
+          <w:sz w:val="19"/>
+          <w:szCs w:val="19"/>
           <w:lang w:val="it-IT"/>
         </w:rPr>
         <w:t>zzo:</w:t>
@@ -1225,8 +1225,8 @@
         <w:rPr>
           <w:rFonts w:ascii="Arial" w:eastAsia="Arial" w:hAnsi="Arial" w:cs="Arial"/>
           <w:spacing w:val="2"/>
-          <w:sz w:val="15"/>
-          <w:szCs w:val="15"/>
+          <w:sz w:val="19"/>
+          <w:szCs w:val="19"/>
           <w:lang w:val="it-IT"/>
         </w:rPr>
         <w:t xml:space="preserve"> </w:t>
@@ -1235,8 +1235,8 @@
         <w:rPr>
           <w:rFonts w:ascii="Arial" w:eastAsia="Arial" w:hAnsi="Arial" w:cs="Arial"/>
           <w:w w:val="103"/>
-          <w:sz w:val="15"/>
-          <w:szCs w:val="15"/>
+          <w:sz w:val="19"/>
+          <w:szCs w:val="19"/>
           <w:u w:val="single" w:color="000000"/>
           <w:lang w:val="it-IT"/>
         </w:rPr>
@@ -1245,8 +1245,8 @@
       <w:r>
         <w:rPr>
           <w:rFonts w:ascii="Arial" w:eastAsia="Arial" w:hAnsi="Arial" w:cs="Arial"/>
-          <w:sz w:val="15"/>
-          <w:szCs w:val="15"/>
+          <w:sz w:val="19"/>
+          <w:szCs w:val="19"/>
           <w:u w:val="single" w:color="000000"/>
           <w:lang w:val="it-IT"/>
         </w:rPr>
@@ -1255,8 +1255,8 @@
       <w:r>
         <w:rPr>
           <w:rFonts w:ascii="Arial" w:eastAsia="Arial" w:hAnsi="Arial" w:cs="Arial"/>
-          <w:sz w:val="15"/>
-          <w:szCs w:val="15"/>
+          <w:sz w:val="19"/>
+          <w:szCs w:val="19"/>
           <w:u w:val="single" w:color="000000"/>
           <w:lang w:val="it-IT"/>
         </w:rPr>
@@ -1265,8 +1265,8 @@
       <w:r>
         <w:rPr>
           <w:rFonts w:ascii="Arial" w:eastAsia="Arial" w:hAnsi="Arial" w:cs="Arial"/>
-          <w:sz w:val="15"/>
-          <w:szCs w:val="15"/>
+          <w:sz w:val="19"/>
+          <w:szCs w:val="19"/>
           <w:u w:val="single" w:color="000000"/>
           <w:lang w:val="it-IT"/>
         </w:rPr>
@@ -1276,8 +1276,8 @@
         <w:rPr>
           <w:rFonts w:ascii="Arial" w:eastAsia="Arial" w:hAnsi="Arial" w:cs="Arial"/>
           <w:spacing w:val="4"/>
-          <w:sz w:val="15"/>
-          <w:szCs w:val="15"/>
+          <w:sz w:val="19"/>
+          <w:szCs w:val="19"/>
           <w:u w:val="single" w:color="000000"/>
           <w:lang w:val="it-IT"/>
         </w:rPr>
@@ -1288,8 +1288,8 @@
           <w:rFonts w:ascii="Arial" w:eastAsia="Arial" w:hAnsi="Arial" w:cs="Arial"/>
           <w:spacing w:val="1"/>
           <w:w w:val="103"/>
-          <w:sz w:val="15"/>
-          <w:szCs w:val="15"/>
+          <w:sz w:val="19"/>
+          <w:szCs w:val="19"/>
           <w:lang w:val="it-IT"/>
         </w:rPr>
         <w:t>C</w:t>
@@ -1298,8 +1298,8 @@
         <w:rPr>
           <w:rFonts w:ascii="Arial" w:eastAsia="Arial" w:hAnsi="Arial" w:cs="Arial"/>
           <w:w w:val="103"/>
-          <w:sz w:val="15"/>
-          <w:szCs w:val="15"/>
+          <w:sz w:val="19"/>
+          <w:szCs w:val="19"/>
           <w:lang w:val="it-IT"/>
         </w:rPr>
         <w:t>o</w:t>
@@ -1309,8 +1309,8 @@
           <w:rFonts w:ascii="Arial" w:eastAsia="Arial" w:hAnsi="Arial" w:cs="Arial"/>
           <w:spacing w:val="-1"/>
           <w:w w:val="103"/>
-          <w:sz w:val="15"/>
-          <w:szCs w:val="15"/>
+          <w:sz w:val="19"/>
+          <w:szCs w:val="19"/>
           <w:lang w:val="it-IT"/>
         </w:rPr>
         <w:t>m</w:t>
@@ -1319,8 +1319,8 @@
         <w:rPr>
           <w:rFonts w:ascii="Arial" w:eastAsia="Arial" w:hAnsi="Arial" w:cs="Arial"/>
           <w:w w:val="103"/>
-          <w:sz w:val="15"/>
-          <w:szCs w:val="15"/>
+          <w:sz w:val="19"/>
+          <w:szCs w:val="19"/>
           <w:lang w:val="it-IT"/>
         </w:rPr>
         <w:t>u</w:t>
@@ -1330,8 +1330,8 @@
           <w:rFonts w:ascii="Arial" w:eastAsia="Arial" w:hAnsi="Arial" w:cs="Arial"/>
           <w:spacing w:val="1"/>
           <w:w w:val="103"/>
-          <w:sz w:val="15"/>
-          <w:szCs w:val="15"/>
+          <w:sz w:val="19"/>
+          <w:szCs w:val="19"/>
           <w:lang w:val="it-IT"/>
         </w:rPr>
         <w:t>n</w:t>
@@ -1340,8 +1340,8 @@
         <w:rPr>
           <w:rFonts w:ascii="Arial" w:eastAsia="Arial" w:hAnsi="Arial" w:cs="Arial"/>
           <w:w w:val="103"/>
-          <w:sz w:val="15"/>
-          <w:szCs w:val="15"/>
+          <w:sz w:val="19"/>
+          <w:szCs w:val="19"/>
           <w:lang w:val="it-IT"/>
         </w:rPr>
         <w:t>e:</w:t>
@@ -1349,8 +1349,8 @@
       <w:r>
         <w:rPr>
           <w:rFonts w:ascii="Arial" w:eastAsia="Arial" w:hAnsi="Arial" w:cs="Arial"/>
-          <w:sz w:val="15"/>
-          <w:szCs w:val="15"/>
+          <w:sz w:val="19"/>
+          <w:szCs w:val="19"/>
           <w:lang w:val="it-IT"/>
         </w:rPr>
         <w:t xml:space="preserve"> </w:t>
@@ -1359,8 +1359,8 @@
         <w:rPr>
           <w:rFonts w:ascii="Arial" w:eastAsia="Arial" w:hAnsi="Arial" w:cs="Arial"/>
           <w:spacing w:val="3"/>
-          <w:sz w:val="15"/>
-          <w:szCs w:val="15"/>
+          <w:sz w:val="19"/>
+          <w:szCs w:val="19"/>
           <w:lang w:val="it-IT"/>
         </w:rPr>
         <w:t xml:space="preserve"> </w:t>
@@ -1369,8 +1369,8 @@
         <w:rPr>
           <w:rFonts w:ascii="Arial" w:eastAsia="Arial" w:hAnsi="Arial" w:cs="Arial"/>
           <w:w w:val="103"/>
-          <w:sz w:val="15"/>
-          <w:szCs w:val="15"/>
+          <w:sz w:val="19"/>
+          <w:szCs w:val="19"/>
           <w:u w:val="single" w:color="000000"/>
           <w:lang w:val="it-IT"/>
         </w:rPr>
@@ -1379,8 +1379,8 @@
       <w:r>
         <w:rPr>
           <w:rFonts w:ascii="Arial" w:eastAsia="Arial" w:hAnsi="Arial" w:cs="Arial"/>
-          <w:sz w:val="15"/>
-          <w:szCs w:val="15"/>
+          <w:sz w:val="19"/>
+          <w:szCs w:val="19"/>
           <w:u w:val="single" w:color="000000"/>
           <w:lang w:val="it-IT"/>
         </w:rPr>
@@ -1389,8 +1389,8 @@
       <w:r>
         <w:rPr>
           <w:rFonts w:ascii="Arial" w:eastAsia="Arial" w:hAnsi="Arial" w:cs="Arial"/>
-          <w:sz w:val="15"/>
-          <w:szCs w:val="15"/>
+          <w:sz w:val="19"/>
+          <w:szCs w:val="19"/>
           <w:u w:val="single" w:color="000000"/>
           <w:lang w:val="it-IT"/>
         </w:rPr>
@@ -1399,8 +1399,8 @@
       <w:r>
         <w:rPr>
           <w:rFonts w:ascii="Arial" w:eastAsia="Arial" w:hAnsi="Arial" w:cs="Arial"/>
-          <w:sz w:val="15"/>
-          <w:szCs w:val="15"/>
+          <w:sz w:val="19"/>
+          <w:szCs w:val="19"/>
           <w:u w:val="single" w:color="000000"/>
           <w:lang w:val="it-IT"/>
         </w:rPr>
@@ -1410,8 +1410,8 @@
         <w:rPr>
           <w:rFonts w:ascii="Arial" w:eastAsia="Arial" w:hAnsi="Arial" w:cs="Arial"/>
           <w:spacing w:val="-13"/>
-          <w:sz w:val="15"/>
-          <w:szCs w:val="15"/>
+          <w:sz w:val="19"/>
+          <w:szCs w:val="19"/>
           <w:u w:val="single" w:color="000000"/>
           <w:lang w:val="it-IT"/>
         </w:rPr>
@@ -1421,8 +1421,8 @@
         <w:rPr>
           <w:rFonts w:ascii="Arial" w:eastAsia="Arial" w:hAnsi="Arial" w:cs="Arial"/>
           <w:spacing w:val="-13"/>
-          <w:sz w:val="15"/>
-          <w:szCs w:val="15"/>
+          <w:sz w:val="19"/>
+          <w:szCs w:val="19"/>
           <w:lang w:val="it-IT"/>
         </w:rPr>
         <w:t xml:space="preserve"> </w:t>
@@ -1432,8 +1432,8 @@
           <w:rFonts w:ascii="Arial" w:eastAsia="Arial" w:hAnsi="Arial" w:cs="Arial"/>
           <w:spacing w:val="-1"/>
           <w:w w:val="103"/>
-          <w:sz w:val="15"/>
-          <w:szCs w:val="15"/>
+          <w:sz w:val="19"/>
+          <w:szCs w:val="19"/>
           <w:lang w:val="it-IT"/>
         </w:rPr>
         <w:t>T</w:t>
@@ -1442,8 +1442,8 @@
         <w:rPr>
           <w:rFonts w:ascii="Arial" w:eastAsia="Arial" w:hAnsi="Arial" w:cs="Arial"/>
           <w:w w:val="103"/>
-          <w:sz w:val="15"/>
-          <w:szCs w:val="15"/>
+          <w:sz w:val="19"/>
+          <w:szCs w:val="19"/>
           <w:lang w:val="it-IT"/>
         </w:rPr>
         <w:t>elefono:</w:t>
@@ -1452,8 +1452,8 @@
         <w:rPr>
           <w:rFonts w:ascii="Arial" w:eastAsia="Arial" w:hAnsi="Arial" w:cs="Arial"/>
           <w:spacing w:val="2"/>
-          <w:sz w:val="15"/>
-          <w:szCs w:val="15"/>
+          <w:sz w:val="19"/>
+          <w:szCs w:val="19"/>
           <w:lang w:val="it-IT"/>
         </w:rPr>
         <w:t xml:space="preserve"> </w:t>
@@ -1462,8 +1462,8 @@
         <w:rPr>
           <w:rFonts w:ascii="Arial" w:eastAsia="Arial" w:hAnsi="Arial" w:cs="Arial"/>
           <w:w w:val="103"/>
-          <w:sz w:val="15"/>
-          <w:szCs w:val="15"/>
+          <w:sz w:val="19"/>
+          <w:szCs w:val="19"/>
           <w:u w:val="single" w:color="000000"/>
           <w:lang w:val="it-IT"/>
         </w:rPr>
@@ -1472,8 +1472,8 @@
       <w:r>
         <w:rPr>
           <w:rFonts w:ascii="Arial" w:eastAsia="Arial" w:hAnsi="Arial" w:cs="Arial"/>
-          <w:sz w:val="15"/>
-          <w:szCs w:val="15"/>
+          <w:sz w:val="19"/>
+          <w:szCs w:val="19"/>
           <w:u w:val="single" w:color="000000"/>
           <w:lang w:val="it-IT"/>
         </w:rPr>
@@ -1482,8 +1482,8 @@
       <w:r>
         <w:rPr>
           <w:rFonts w:ascii="Arial" w:eastAsia="Arial" w:hAnsi="Arial" w:cs="Arial"/>
-          <w:sz w:val="15"/>
-          <w:szCs w:val="15"/>
+          <w:sz w:val="19"/>
+          <w:szCs w:val="19"/>
           <w:u w:val="single" w:color="000000"/>
           <w:lang w:val="it-IT"/>
         </w:rPr>
@@ -1492,8 +1492,8 @@
       <w:r>
         <w:rPr>
           <w:rFonts w:ascii="Arial" w:eastAsia="Arial" w:hAnsi="Arial" w:cs="Arial"/>
-          <w:sz w:val="15"/>
-          <w:szCs w:val="15"/>
+          <w:sz w:val="19"/>
+          <w:szCs w:val="19"/>
           <w:lang w:val="it-IT"/>
         </w:rPr>
         <w:t>N</w:t>
@@ -1502,8 +1502,8 @@
         <w:rPr>
           <w:rFonts w:ascii="Arial" w:eastAsia="Arial" w:hAnsi="Arial" w:cs="Arial"/>
           <w:spacing w:val="1"/>
-          <w:sz w:val="15"/>
-          <w:szCs w:val="15"/>
+          <w:sz w:val="19"/>
+          <w:szCs w:val="19"/>
           <w:lang w:val="it-IT"/>
         </w:rPr>
         <w:t>u</w:t>
@@ -1511,8 +1511,8 @@
       <w:r>
         <w:rPr>
           <w:rFonts w:ascii="Arial" w:eastAsia="Arial" w:hAnsi="Arial" w:cs="Arial"/>
-          <w:sz w:val="15"/>
-          <w:szCs w:val="15"/>
+          <w:sz w:val="19"/>
+          <w:szCs w:val="19"/>
           <w:lang w:val="it-IT"/>
         </w:rPr>
         <w:t>mero</w:t>
@@ -1521,8 +1521,8 @@
         <w:rPr>
           <w:rFonts w:ascii="Arial" w:eastAsia="Arial" w:hAnsi="Arial" w:cs="Arial"/>
           <w:spacing w:val="19"/>
-          <w:sz w:val="15"/>
-          <w:szCs w:val="15"/>
+          <w:sz w:val="19"/>
+          <w:szCs w:val="19"/>
           <w:lang w:val="it-IT"/>
         </w:rPr>
         <w:t xml:space="preserve"> </w:t>
@@ -1532,8 +1532,8 @@
           <w:rFonts w:ascii="Arial" w:eastAsia="Arial" w:hAnsi="Arial" w:cs="Arial"/>
           <w:spacing w:val="-1"/>
           <w:w w:val="103"/>
-          <w:sz w:val="15"/>
-          <w:szCs w:val="15"/>
+          <w:sz w:val="19"/>
+          <w:szCs w:val="19"/>
           <w:lang w:val="it-IT"/>
         </w:rPr>
         <w:t>P</w:t>
@@ -1542,8 +1542,8 @@
         <w:rPr>
           <w:rFonts w:ascii="Arial" w:eastAsia="Arial" w:hAnsi="Arial" w:cs="Arial"/>
           <w:w w:val="103"/>
-          <w:sz w:val="15"/>
-          <w:szCs w:val="15"/>
+          <w:sz w:val="19"/>
+          <w:szCs w:val="19"/>
           <w:lang w:val="it-IT"/>
         </w:rPr>
         <w:t>dr:</w:t>
@@ -1552,8 +1552,8 @@
         <w:rPr>
           <w:rFonts w:ascii="Arial" w:eastAsia="Arial" w:hAnsi="Arial" w:cs="Arial"/>
           <w:spacing w:val="2"/>
-          <w:sz w:val="15"/>
-          <w:szCs w:val="15"/>
+          <w:sz w:val="19"/>
+          <w:szCs w:val="19"/>
           <w:lang w:val="it-IT"/>
         </w:rPr>
         <w:t xml:space="preserve"> </w:t>
@@ -1562,8 +1562,8 @@
         <w:rPr>
           <w:rFonts w:ascii="Arial" w:eastAsia="Arial" w:hAnsi="Arial" w:cs="Arial"/>
           <w:w w:val="103"/>
-          <w:sz w:val="15"/>
-          <w:szCs w:val="15"/>
+          <w:sz w:val="19"/>
+          <w:szCs w:val="19"/>
           <w:u w:val="single" w:color="000000"/>
           <w:lang w:val="it-IT"/>
         </w:rPr>
@@ -1572,8 +1572,8 @@
       <w:r>
         <w:rPr>
           <w:rFonts w:ascii="Arial" w:eastAsia="Arial" w:hAnsi="Arial" w:cs="Arial"/>
-          <w:sz w:val="15"/>
-          <w:szCs w:val="15"/>
+          <w:sz w:val="19"/>
+          <w:szCs w:val="19"/>
           <w:u w:val="single" w:color="000000"/>
           <w:lang w:val="it-IT"/>
         </w:rPr>
@@ -1582,8 +1582,8 @@
       <w:r>
         <w:rPr>
           <w:rFonts w:ascii="Arial" w:eastAsia="Arial" w:hAnsi="Arial" w:cs="Arial"/>
-          <w:sz w:val="15"/>
-          <w:szCs w:val="15"/>
+          <w:sz w:val="19"/>
+          <w:szCs w:val="19"/>
           <w:u w:val="single" w:color="000000"/>
           <w:lang w:val="it-IT"/>
         </w:rPr>
@@ -1593,8 +1593,8 @@
         <w:rPr>
           <w:rFonts w:ascii="Arial" w:eastAsia="Arial" w:hAnsi="Arial" w:cs="Arial"/>
           <w:w w:val="103"/>
-          <w:sz w:val="15"/>
-          <w:szCs w:val="15"/>
+          <w:sz w:val="19"/>
+          <w:szCs w:val="19"/>
           <w:lang w:val="it-IT"/>
         </w:rPr>
         <w:t>Numero</w:t>
@@ -1603,8 +1603,8 @@
         <w:rPr>
           <w:rFonts w:ascii="Arial" w:eastAsia="Arial" w:hAnsi="Arial" w:cs="Arial"/>
           <w:spacing w:val="2"/>
-          <w:sz w:val="15"/>
-          <w:szCs w:val="15"/>
+          <w:sz w:val="19"/>
+          <w:szCs w:val="19"/>
           <w:lang w:val="it-IT"/>
         </w:rPr>
         <w:t xml:space="preserve"> </w:t>
@@ -1613,8 +1613,8 @@
         <w:rPr>
           <w:rFonts w:ascii="Arial" w:eastAsia="Arial" w:hAnsi="Arial" w:cs="Arial"/>
           <w:w w:val="103"/>
-          <w:sz w:val="15"/>
-          <w:szCs w:val="15"/>
+          <w:sz w:val="19"/>
+          <w:szCs w:val="19"/>
           <w:lang w:val="it-IT"/>
         </w:rPr>
         <w:t>prati</w:t>
@@ -1624,8 +1624,8 @@
           <w:rFonts w:ascii="Arial" w:eastAsia="Arial" w:hAnsi="Arial" w:cs="Arial"/>
           <w:spacing w:val="2"/>
           <w:w w:val="103"/>
-          <w:sz w:val="15"/>
-          <w:szCs w:val="15"/>
+          <w:sz w:val="19"/>
+          <w:szCs w:val="19"/>
           <w:lang w:val="it-IT"/>
         </w:rPr>
         <w:t>c</w:t>
@@ -1635,8 +1635,8 @@
           <w:rFonts w:ascii="Arial" w:eastAsia="Arial" w:hAnsi="Arial" w:cs="Arial"/>
           <w:spacing w:val="-1"/>
           <w:w w:val="103"/>
-          <w:sz w:val="15"/>
-          <w:szCs w:val="15"/>
+          <w:sz w:val="19"/>
+          <w:szCs w:val="19"/>
           <w:lang w:val="it-IT"/>
         </w:rPr>
         <w:t>a</w:t>
@@ -1645,8 +1645,8 @@
         <w:rPr>
           <w:rFonts w:ascii="Arial" w:eastAsia="Arial" w:hAnsi="Arial" w:cs="Arial"/>
           <w:w w:val="103"/>
-          <w:sz w:val="15"/>
-          <w:szCs w:val="15"/>
+          <w:sz w:val="19"/>
+          <w:szCs w:val="19"/>
           <w:lang w:val="it-IT"/>
         </w:rPr>
         <w:t>:</w:t>
@@ -1658,8 +1658,8 @@
         <w:rPr>
           <w:rFonts w:ascii="Arial" w:eastAsia="Arial" w:hAnsi="Arial" w:cs="Arial"/>
           <w:w w:val="103"/>
-          <w:sz w:val="15"/>
-          <w:szCs w:val="15"/>
+          <w:sz w:val="19"/>
+          <w:szCs w:val="19"/>
           <w:lang w:val="it-IT"/>
         </w:rPr>
         <w:t xml:space="preserve">: {{NUMERO_PRATICA}}</w:t>
@@ -1672,8 +1672,8 @@
         <w:jc w:val="both"/>
         <w:rPr>
           <w:rFonts w:ascii="Arial" w:eastAsia="Arial" w:hAnsi="Arial" w:cs="Arial"/>
-          <w:sz w:val="15"/>
-          <w:szCs w:val="15"/>
+          <w:sz w:val="17"/>
+          <w:szCs w:val="17"/>
           <w:lang w:val="it-IT"/>
         </w:rPr>
       </w:pPr>
@@ -1681,8 +1681,8 @@
         <w:rPr>
           <w:rFonts w:ascii="Arial" w:eastAsia="Arial" w:hAnsi="Arial" w:cs="Arial"/>
           <w:w w:val="103"/>
-          <w:sz w:val="15"/>
-          <w:szCs w:val="15"/>
+          <w:sz w:val="17"/>
+          <w:szCs w:val="17"/>
           <w:lang w:val="it-IT"/>
         </w:rPr>
         <w:t>Data</w:t>
@@ -1691,8 +1691,8 @@
         <w:rPr>
           <w:rFonts w:ascii="Arial" w:eastAsia="Arial" w:hAnsi="Arial" w:cs="Arial"/>
           <w:spacing w:val="2"/>
-          <w:sz w:val="15"/>
-          <w:szCs w:val="15"/>
+          <w:sz w:val="17"/>
+          <w:szCs w:val="17"/>
           <w:lang w:val="it-IT"/>
         </w:rPr>
         <w:t xml:space="preserve"> </w:t>
@@ -1702,8 +1702,8 @@
         <w:rPr>
           <w:rFonts w:ascii="Arial" w:eastAsia="Arial" w:hAnsi="Arial" w:cs="Arial"/>
           <w:w w:val="103"/>
-          <w:sz w:val="15"/>
-          <w:szCs w:val="15"/>
+          <w:sz w:val="17"/>
+          <w:szCs w:val="17"/>
           <w:lang w:val="it-IT"/>
         </w:rPr>
         <w:t>richiesta:</w:t>
@@ -1712,8 +1712,8 @@
         <w:rPr>
           <w:rFonts w:ascii="Arial" w:eastAsia="Arial" w:hAnsi="Arial" w:cs="Arial"/>
           <w:spacing w:val="2"/>
-          <w:sz w:val="15"/>
-          <w:szCs w:val="15"/>
+          <w:sz w:val="17"/>
+          <w:szCs w:val="17"/>
           <w:lang w:val="it-IT"/>
         </w:rPr>
         <w:t xml:space="preserve"> </w:t>
@@ -1722,8 +1722,8 @@
         <w:rPr>
           <w:rFonts w:ascii="Arial" w:eastAsia="Arial" w:hAnsi="Arial" w:cs="Arial"/>
           <w:w w:val="103"/>
-          <w:sz w:val="15"/>
-          <w:szCs w:val="15"/>
+          <w:sz w:val="17"/>
+          <w:szCs w:val="17"/>
           <w:u w:val="single" w:color="000000"/>
           <w:lang w:val="it-IT"/>
         </w:rPr>
@@ -1732,8 +1732,8 @@
       <w:r>
         <w:rPr>
           <w:rFonts w:ascii="Arial" w:eastAsia="Arial" w:hAnsi="Arial" w:cs="Arial"/>
-          <w:sz w:val="15"/>
-          <w:szCs w:val="15"/>
+          <w:sz w:val="17"/>
+          <w:szCs w:val="17"/>
           <w:u w:val="single" w:color="000000"/>
           <w:lang w:val="it-IT"/>
         </w:rPr>
@@ -1743,8 +1743,8 @@
       <w:r>
         <w:rPr>
           <w:rFonts w:ascii="Arial" w:eastAsia="Arial" w:hAnsi="Arial" w:cs="Arial"/>
-          <w:sz w:val="15"/>
-          <w:szCs w:val="15"/>
+          <w:sz w:val="17"/>
+          <w:szCs w:val="17"/>
           <w:u w:val="single" w:color="000000"/>
           <w:lang w:val="it-IT"/>
         </w:rPr>
@@ -1754,8 +1754,8 @@
         <w:rPr>
           <w:rFonts w:ascii="Arial" w:eastAsia="Arial" w:hAnsi="Arial" w:cs="Arial"/>
           <w:spacing w:val="4"/>
-          <w:sz w:val="15"/>
-          <w:szCs w:val="15"/>
+          <w:sz w:val="17"/>
+          <w:szCs w:val="17"/>
           <w:u w:val="single" w:color="000000"/>
           <w:lang w:val="it-IT"/>
         </w:rPr>
@@ -1764,8 +1764,8 @@
       <w:r>
         <w:rPr>
           <w:rFonts w:ascii="Arial" w:eastAsia="Arial" w:hAnsi="Arial" w:cs="Arial"/>
-          <w:sz w:val="15"/>
-          <w:szCs w:val="15"/>
+          <w:sz w:val="17"/>
+          <w:szCs w:val="17"/>
           <w:lang w:val="it-IT"/>
         </w:rPr>
         <w:t xml:space="preserve"> </w:t>
@@ -1774,8 +1774,8 @@
         <w:rPr>
           <w:rFonts w:ascii="Arial" w:eastAsia="Arial" w:hAnsi="Arial" w:cs="Arial"/>
           <w:spacing w:val="3"/>
-          <w:sz w:val="15"/>
-          <w:szCs w:val="15"/>
+          <w:sz w:val="17"/>
+          <w:szCs w:val="17"/>
           <w:lang w:val="it-IT"/>
         </w:rPr>
         <w:t xml:space="preserve"> </w:t>
@@ -1785,8 +1785,8 @@
           <w:rFonts w:ascii="Arial" w:eastAsia="Arial" w:hAnsi="Arial" w:cs="Arial"/>
           <w:spacing w:val="1"/>
           <w:w w:val="103"/>
-          <w:sz w:val="15"/>
-          <w:szCs w:val="15"/>
+          <w:sz w:val="17"/>
+          <w:szCs w:val="17"/>
           <w:lang w:val="it-IT"/>
         </w:rPr>
         <w:t>Nu</w:t>
@@ -1796,8 +1796,8 @@
           <w:rFonts w:ascii="Arial" w:eastAsia="Arial" w:hAnsi="Arial" w:cs="Arial"/>
           <w:spacing w:val="-1"/>
           <w:w w:val="103"/>
-          <w:sz w:val="15"/>
-          <w:szCs w:val="15"/>
+          <w:sz w:val="17"/>
+          <w:szCs w:val="17"/>
           <w:lang w:val="it-IT"/>
         </w:rPr>
         <w:t>m</w:t>
@@ -1806,8 +1806,8 @@
         <w:rPr>
           <w:rFonts w:ascii="Arial" w:eastAsia="Arial" w:hAnsi="Arial" w:cs="Arial"/>
           <w:w w:val="103"/>
-          <w:sz w:val="15"/>
-          <w:szCs w:val="15"/>
+          <w:sz w:val="17"/>
+          <w:szCs w:val="17"/>
           <w:lang w:val="it-IT"/>
         </w:rPr>
         <w:t>ero</w:t>
@@ -1816,8 +1816,8 @@
         <w:rPr>
           <w:rFonts w:ascii="Arial" w:eastAsia="Arial" w:hAnsi="Arial" w:cs="Arial"/>
           <w:spacing w:val="2"/>
-          <w:sz w:val="15"/>
-          <w:szCs w:val="15"/>
+          <w:sz w:val="17"/>
+          <w:szCs w:val="17"/>
           <w:lang w:val="it-IT"/>
         </w:rPr>
         <w:t xml:space="preserve"> </w:t>
@@ -1826,8 +1826,8 @@
         <w:rPr>
           <w:rFonts w:ascii="Arial" w:eastAsia="Arial" w:hAnsi="Arial" w:cs="Arial"/>
           <w:w w:val="103"/>
-          <w:sz w:val="15"/>
-          <w:szCs w:val="15"/>
+          <w:sz w:val="17"/>
+          <w:szCs w:val="17"/>
           <w:lang w:val="it-IT"/>
         </w:rPr>
         <w:t>rich</w:t>
@@ -1837,8 +1837,8 @@
           <w:rFonts w:ascii="Arial" w:eastAsia="Arial" w:hAnsi="Arial" w:cs="Arial"/>
           <w:spacing w:val="2"/>
           <w:w w:val="103"/>
-          <w:sz w:val="15"/>
-          <w:szCs w:val="15"/>
+          <w:sz w:val="17"/>
+          <w:szCs w:val="17"/>
           <w:lang w:val="it-IT"/>
         </w:rPr>
         <w:t>i</w:t>
@@ -1847,8 +1847,8 @@
         <w:rPr>
           <w:rFonts w:ascii="Arial" w:eastAsia="Arial" w:hAnsi="Arial" w:cs="Arial"/>
           <w:w w:val="103"/>
-          <w:sz w:val="15"/>
-          <w:szCs w:val="15"/>
+          <w:sz w:val="17"/>
+          <w:szCs w:val="17"/>
           <w:lang w:val="it-IT"/>
         </w:rPr>
         <w:t>esta:</w:t>
@@ -1857,8 +1857,8 @@
         <w:rPr>
           <w:rFonts w:ascii="Arial" w:eastAsia="Arial" w:hAnsi="Arial" w:cs="Arial"/>
           <w:spacing w:val="2"/>
-          <w:sz w:val="15"/>
-          <w:szCs w:val="15"/>
+          <w:sz w:val="17"/>
+          <w:szCs w:val="17"/>
           <w:lang w:val="it-IT"/>
         </w:rPr>
         <w:t xml:space="preserve"> </w:t>
@@ -1867,8 +1867,8 @@
         <w:rPr>
           <w:rFonts w:ascii="Arial" w:eastAsia="Arial" w:hAnsi="Arial" w:cs="Arial"/>
           <w:w w:val="103"/>
-          <w:sz w:val="15"/>
-          <w:szCs w:val="15"/>
+          <w:sz w:val="17"/>
+          <w:szCs w:val="17"/>
           <w:u w:val="single" w:color="000000"/>
           <w:lang w:val="it-IT"/>
         </w:rPr>
@@ -1877,8 +1877,8 @@
       <w:r>
         <w:rPr>
           <w:rFonts w:ascii="Arial" w:eastAsia="Arial" w:hAnsi="Arial" w:cs="Arial"/>
-          <w:sz w:val="15"/>
-          <w:szCs w:val="15"/>
+          <w:sz w:val="17"/>
+          <w:szCs w:val="17"/>
           <w:u w:val="single" w:color="000000"/>
           <w:lang w:val="it-IT"/>
         </w:rPr>
@@ -1887,8 +1887,8 @@
       <w:r>
         <w:rPr>
           <w:rFonts w:ascii="Arial" w:eastAsia="Arial" w:hAnsi="Arial" w:cs="Arial"/>
-          <w:sz w:val="15"/>
-          <w:szCs w:val="15"/>
+          <w:sz w:val="17"/>
+          <w:szCs w:val="17"/>
           <w:u w:val="single" w:color="000000"/>
           <w:lang w:val="it-IT"/>
         </w:rPr>
@@ -1899,8 +1899,8 @@
       <w:pPr>
         <w:spacing w:before="1" w:after="0" w:line="180" w:lineRule="exact"/>
         <w:rPr>
-          <w:sz w:val="18"/>
-          <w:szCs w:val="18"/>
+          <w:sz w:val="19"/>
+          <w:szCs w:val="19"/>
           <w:lang w:val="it-IT"/>
         </w:rPr>
       </w:pPr>
@@ -10325,7 +10325,7 @@
           <w:u w:val="single" w:color="000000"/>
           <w:lang w:val="it-IT"/>
         </w:rPr>
-        <w:t xml:space="preserve"> </w:t>
+        <w:t xml:space="preserve">{{MATRICOLA_ESISTENTE}}</w:t>
       </w:r>
       <w:r>
         <w:rPr>
@@ -11527,7 +11527,7 @@
           <w:szCs w:val="15"/>
           <w:lang w:val="it-IT"/>
         </w:rPr>
-        <w:t xml:space="preserve"> </w:t>
+        <w:t xml:space="preserve">{{ADDETTO}}</w:t>
       </w:r>
       <w:r>
         <w:rPr>

</xml_diff>

<commit_message>
fix modulo firenze 5.0
</commit_message>
<xml_diff>
--- a/public/templates/ALLEGATO_10_FIRENZE.docx
+++ b/public/templates/ALLEGATO_10_FIRENZE.docx
@@ -1672,8 +1672,8 @@
         <w:jc w:val="both"/>
         <w:rPr>
           <w:rFonts w:ascii="Arial" w:eastAsia="Arial" w:hAnsi="Arial" w:cs="Arial"/>
-          <w:sz w:val="17"/>
-          <w:szCs w:val="17"/>
+          <w:sz w:val="25"/>
+          <w:szCs w:val="25"/>
           <w:lang w:val="it-IT"/>
         </w:rPr>
       </w:pPr>
@@ -1681,8 +1681,8 @@
         <w:rPr>
           <w:rFonts w:ascii="Arial" w:eastAsia="Arial" w:hAnsi="Arial" w:cs="Arial"/>
           <w:w w:val="103"/>
-          <w:sz w:val="17"/>
-          <w:szCs w:val="17"/>
+          <w:sz w:val="25"/>
+          <w:szCs w:val="25"/>
           <w:lang w:val="it-IT"/>
         </w:rPr>
         <w:t>Data</w:t>
@@ -1691,8 +1691,8 @@
         <w:rPr>
           <w:rFonts w:ascii="Arial" w:eastAsia="Arial" w:hAnsi="Arial" w:cs="Arial"/>
           <w:spacing w:val="2"/>
-          <w:sz w:val="17"/>
-          <w:szCs w:val="17"/>
+          <w:sz w:val="25"/>
+          <w:szCs w:val="25"/>
           <w:lang w:val="it-IT"/>
         </w:rPr>
         <w:t xml:space="preserve"> </w:t>
@@ -1702,8 +1702,8 @@
         <w:rPr>
           <w:rFonts w:ascii="Arial" w:eastAsia="Arial" w:hAnsi="Arial" w:cs="Arial"/>
           <w:w w:val="103"/>
-          <w:sz w:val="17"/>
-          <w:szCs w:val="17"/>
+          <w:sz w:val="25"/>
+          <w:szCs w:val="25"/>
           <w:lang w:val="it-IT"/>
         </w:rPr>
         <w:t>richiesta:</w:t>
@@ -1712,8 +1712,8 @@
         <w:rPr>
           <w:rFonts w:ascii="Arial" w:eastAsia="Arial" w:hAnsi="Arial" w:cs="Arial"/>
           <w:spacing w:val="2"/>
-          <w:sz w:val="17"/>
-          <w:szCs w:val="17"/>
+          <w:sz w:val="25"/>
+          <w:szCs w:val="25"/>
           <w:lang w:val="it-IT"/>
         </w:rPr>
         <w:t xml:space="preserve"> </w:t>
@@ -1722,8 +1722,8 @@
         <w:rPr>
           <w:rFonts w:ascii="Arial" w:eastAsia="Arial" w:hAnsi="Arial" w:cs="Arial"/>
           <w:w w:val="103"/>
-          <w:sz w:val="17"/>
-          <w:szCs w:val="17"/>
+          <w:sz w:val="25"/>
+          <w:szCs w:val="25"/>
           <w:u w:val="single" w:color="000000"/>
           <w:lang w:val="it-IT"/>
         </w:rPr>
@@ -1732,8 +1732,8 @@
       <w:r>
         <w:rPr>
           <w:rFonts w:ascii="Arial" w:eastAsia="Arial" w:hAnsi="Arial" w:cs="Arial"/>
-          <w:sz w:val="17"/>
-          <w:szCs w:val="17"/>
+          <w:sz w:val="25"/>
+          <w:szCs w:val="25"/>
           <w:u w:val="single" w:color="000000"/>
           <w:lang w:val="it-IT"/>
         </w:rPr>
@@ -1743,8 +1743,8 @@
       <w:r>
         <w:rPr>
           <w:rFonts w:ascii="Arial" w:eastAsia="Arial" w:hAnsi="Arial" w:cs="Arial"/>
-          <w:sz w:val="17"/>
-          <w:szCs w:val="17"/>
+          <w:sz w:val="25"/>
+          <w:szCs w:val="25"/>
           <w:u w:val="single" w:color="000000"/>
           <w:lang w:val="it-IT"/>
         </w:rPr>
@@ -1754,8 +1754,8 @@
         <w:rPr>
           <w:rFonts w:ascii="Arial" w:eastAsia="Arial" w:hAnsi="Arial" w:cs="Arial"/>
           <w:spacing w:val="4"/>
-          <w:sz w:val="17"/>
-          <w:szCs w:val="17"/>
+          <w:sz w:val="25"/>
+          <w:szCs w:val="25"/>
           <w:u w:val="single" w:color="000000"/>
           <w:lang w:val="it-IT"/>
         </w:rPr>
@@ -1764,8 +1764,8 @@
       <w:r>
         <w:rPr>
           <w:rFonts w:ascii="Arial" w:eastAsia="Arial" w:hAnsi="Arial" w:cs="Arial"/>
-          <w:sz w:val="17"/>
-          <w:szCs w:val="17"/>
+          <w:sz w:val="25"/>
+          <w:szCs w:val="25"/>
           <w:lang w:val="it-IT"/>
         </w:rPr>
         <w:t xml:space="preserve"> </w:t>
@@ -1774,8 +1774,8 @@
         <w:rPr>
           <w:rFonts w:ascii="Arial" w:eastAsia="Arial" w:hAnsi="Arial" w:cs="Arial"/>
           <w:spacing w:val="3"/>
-          <w:sz w:val="17"/>
-          <w:szCs w:val="17"/>
+          <w:sz w:val="25"/>
+          <w:szCs w:val="25"/>
           <w:lang w:val="it-IT"/>
         </w:rPr>
         <w:t xml:space="preserve"> </w:t>
@@ -1785,8 +1785,8 @@
           <w:rFonts w:ascii="Arial" w:eastAsia="Arial" w:hAnsi="Arial" w:cs="Arial"/>
           <w:spacing w:val="1"/>
           <w:w w:val="103"/>
-          <w:sz w:val="17"/>
-          <w:szCs w:val="17"/>
+          <w:sz w:val="25"/>
+          <w:szCs w:val="25"/>
           <w:lang w:val="it-IT"/>
         </w:rPr>
         <w:t>Nu</w:t>
@@ -1796,8 +1796,8 @@
           <w:rFonts w:ascii="Arial" w:eastAsia="Arial" w:hAnsi="Arial" w:cs="Arial"/>
           <w:spacing w:val="-1"/>
           <w:w w:val="103"/>
-          <w:sz w:val="17"/>
-          <w:szCs w:val="17"/>
+          <w:sz w:val="25"/>
+          <w:szCs w:val="25"/>
           <w:lang w:val="it-IT"/>
         </w:rPr>
         <w:t>m</w:t>
@@ -1806,8 +1806,8 @@
         <w:rPr>
           <w:rFonts w:ascii="Arial" w:eastAsia="Arial" w:hAnsi="Arial" w:cs="Arial"/>
           <w:w w:val="103"/>
-          <w:sz w:val="17"/>
-          <w:szCs w:val="17"/>
+          <w:sz w:val="25"/>
+          <w:szCs w:val="25"/>
           <w:lang w:val="it-IT"/>
         </w:rPr>
         <w:t>ero</w:t>
@@ -1816,8 +1816,8 @@
         <w:rPr>
           <w:rFonts w:ascii="Arial" w:eastAsia="Arial" w:hAnsi="Arial" w:cs="Arial"/>
           <w:spacing w:val="2"/>
-          <w:sz w:val="17"/>
-          <w:szCs w:val="17"/>
+          <w:sz w:val="25"/>
+          <w:szCs w:val="25"/>
           <w:lang w:val="it-IT"/>
         </w:rPr>
         <w:t xml:space="preserve"> </w:t>
@@ -1826,8 +1826,8 @@
         <w:rPr>
           <w:rFonts w:ascii="Arial" w:eastAsia="Arial" w:hAnsi="Arial" w:cs="Arial"/>
           <w:w w:val="103"/>
-          <w:sz w:val="17"/>
-          <w:szCs w:val="17"/>
+          <w:sz w:val="25"/>
+          <w:szCs w:val="25"/>
           <w:lang w:val="it-IT"/>
         </w:rPr>
         <w:t>rich</w:t>
@@ -1837,8 +1837,8 @@
           <w:rFonts w:ascii="Arial" w:eastAsia="Arial" w:hAnsi="Arial" w:cs="Arial"/>
           <w:spacing w:val="2"/>
           <w:w w:val="103"/>
-          <w:sz w:val="17"/>
-          <w:szCs w:val="17"/>
+          <w:sz w:val="25"/>
+          <w:szCs w:val="25"/>
           <w:lang w:val="it-IT"/>
         </w:rPr>
         <w:t>i</w:t>
@@ -1847,8 +1847,8 @@
         <w:rPr>
           <w:rFonts w:ascii="Arial" w:eastAsia="Arial" w:hAnsi="Arial" w:cs="Arial"/>
           <w:w w:val="103"/>
-          <w:sz w:val="17"/>
-          <w:szCs w:val="17"/>
+          <w:sz w:val="25"/>
+          <w:szCs w:val="25"/>
           <w:lang w:val="it-IT"/>
         </w:rPr>
         <w:t>esta:</w:t>
@@ -1857,8 +1857,8 @@
         <w:rPr>
           <w:rFonts w:ascii="Arial" w:eastAsia="Arial" w:hAnsi="Arial" w:cs="Arial"/>
           <w:spacing w:val="2"/>
-          <w:sz w:val="17"/>
-          <w:szCs w:val="17"/>
+          <w:sz w:val="25"/>
+          <w:szCs w:val="25"/>
           <w:lang w:val="it-IT"/>
         </w:rPr>
         <w:t xml:space="preserve"> </w:t>
@@ -1867,8 +1867,8 @@
         <w:rPr>
           <w:rFonts w:ascii="Arial" w:eastAsia="Arial" w:hAnsi="Arial" w:cs="Arial"/>
           <w:w w:val="103"/>
-          <w:sz w:val="17"/>
-          <w:szCs w:val="17"/>
+          <w:sz w:val="25"/>
+          <w:szCs w:val="25"/>
           <w:u w:val="single" w:color="000000"/>
           <w:lang w:val="it-IT"/>
         </w:rPr>
@@ -1877,8 +1877,8 @@
       <w:r>
         <w:rPr>
           <w:rFonts w:ascii="Arial" w:eastAsia="Arial" w:hAnsi="Arial" w:cs="Arial"/>
-          <w:sz w:val="17"/>
-          <w:szCs w:val="17"/>
+          <w:sz w:val="25"/>
+          <w:szCs w:val="25"/>
           <w:u w:val="single" w:color="000000"/>
           <w:lang w:val="it-IT"/>
         </w:rPr>
@@ -1887,8 +1887,8 @@
       <w:r>
         <w:rPr>
           <w:rFonts w:ascii="Arial" w:eastAsia="Arial" w:hAnsi="Arial" w:cs="Arial"/>
-          <w:sz w:val="17"/>
-          <w:szCs w:val="17"/>
+          <w:sz w:val="25"/>
+          <w:szCs w:val="25"/>
           <w:u w:val="single" w:color="000000"/>
           <w:lang w:val="it-IT"/>
         </w:rPr>
@@ -1899,8 +1899,8 @@
       <w:pPr>
         <w:spacing w:before="1" w:after="0" w:line="180" w:lineRule="exact"/>
         <w:rPr>
-          <w:sz w:val="19"/>
-          <w:szCs w:val="19"/>
+          <w:sz w:val="25"/>
+          <w:szCs w:val="25"/>
           <w:lang w:val="it-IT"/>
         </w:rPr>
       </w:pPr>
@@ -10464,7 +10464,7 @@
           <w:u w:val="single" w:color="000000"/>
           <w:lang w:val="it-IT"/>
         </w:rPr>
-        <w:t xml:space="preserve"> </w:t>
+        <w:t xml:space="preserve">{{MATRICOLA_ESISTENTE}}</w:t>
       </w:r>
       <w:r>
         <w:rPr>
@@ -11569,7 +11569,7 @@
           <w:u w:val="single" w:color="000000"/>
           <w:lang w:val="it-IT"/>
         </w:rPr>
-        <w:t xml:space="preserve"> </w:t>
+        <w:t xml:space="preserve">{{ADDETTO}}</w:t>
       </w:r>
       <w:r>
         <w:rPr>

</xml_diff>